<commit_message>
Add missing Table 2 placeholder and rebuild
Table 2 (volume trajectory medians/IQR by group) was prepared but
never explicitly referenced in the manuscript. Added a placeholder
in section 3.2 next to the Figure 1 reference where the trajectory
is discussed in the text.

Reading copy now embeds all 6 tables and 5 figures.

Co-Authored-By: Claude Opus 4.6 <noreply@anthropic.com>
</commit_message>
<xml_diff>
--- a/forskning/ncc-kohort/submission_pse/MANUSCRIPT_ANONYMIZED.docx
+++ b/forskning/ncc-kohort/submission_pse/MANUSCRIPT_ANONYMIZED.docx
@@ -1077,6 +1077,24 @@
           <w:bCs/>
         </w:rPr>
         <w:t xml:space="preserve">Figure 1 about here</w:t>
+      </w:r>
+      <w:r>
+        <w:t xml:space="preserve">]</w:t>
+      </w:r>
+    </w:p>
+    <w:p>
+      <w:pPr>
+        <w:pStyle w:val="BodyText"/>
+      </w:pPr>
+      <w:r>
+        <w:t xml:space="preserve">[</w:t>
+      </w:r>
+      <w:r>
+        <w:rPr>
+          <w:b/>
+          <w:bCs/>
+        </w:rPr>
+        <w:t xml:space="preserve">Table 2 about here</w:t>
       </w:r>
       <w:r>
         <w:t xml:space="preserve">]</w:t>

</xml_diff>